<commit_message>
Update committee methodology and results for 36m consistency
</commit_message>
<xml_diff>
--- a/projects/criterios-selecao-fundos-cp/Critérios de Seleção de Fundos CP_v4.docx
+++ b/projects/criterios-selecao-fundos-cp/Critérios de Seleção de Fundos CP_v4.docx
@@ -46,7 +46,7 @@
         <w:rPr>
           <w:rFonts w:asciiTheme="minorHAnsi" w:hAnsiTheme="minorHAnsi" w:cstheme="minorHAnsi"/>
         </w:rPr>
-        <w:t>Setembro de 2026</w:t>
+        <w:t>Outubro de 2026</w:t>
       </w:r>
     </w:p>
     <w:p>
@@ -92,7 +92,7 @@
         <w:rPr>
           <w:rFonts w:asciiTheme="minorHAnsi" w:hAnsiTheme="minorHAnsi" w:cstheme="minorHAnsi"/>
         </w:rPr>
-        <w:t xml:space="preserve">A rodada mais recente contém 53 fundos cadastrados; 47 têm os 36 meses completos e comparáveis exigidos pelo modelo. Entre os elegíveis, 9 obtiveram aprovação quantitativa com margem, 13 ficaram na fronteira, 23 não foram aprovados quantitativamente e 2 tiveram </w:t>
+        <w:t xml:space="preserve">A rodada mais recente contém 53 fundos cadastrados; 47 têm os 36 meses completos e comparáveis exigidos pelo modelo. Entre os elegíveis, 9 obtiveram aprovação quantitativa com margem, 12 ficaram na fronteira, 24 não foram aprovados quantitativamente e 2 tiveram </w:t>
       </w:r>
       <w:proofErr w:type="spellStart"/>
       <w:r>
@@ -106,7 +106,7 @@
         <w:rPr>
           <w:rFonts w:asciiTheme="minorHAnsi" w:hAnsiTheme="minorHAnsi" w:cstheme="minorHAnsi"/>
         </w:rPr>
-        <w:t xml:space="preserve"> flag absoluto. Assim, 22 fundos formam a prioridade inicial de diligência. Os resultados refletem dados disponíveis até 21 de setembro de 2026 e janela encerrada em agosto de 2026; não são atributos permanentes dos fundos.</w:t>
+        <w:t xml:space="preserve"> flag absoluto. Assim, 21 fundos formam a prioridade inicial de diligência. Os resultados refletem dados disponíveis até 18 de setembro de 2026 e janela encerrada em agosto de 2026; não são atributos permanentes dos fundos.</w:t>
       </w:r>
     </w:p>
     <w:p>
@@ -704,19 +704,8 @@
             <w:vAlign w:val="center"/>
           </w:tcPr>
           <w:p>
-            <w:pPr>
-              <w:spacing w:after="0"/>
-              <w:jc w:val="both"/>
-              <w:rPr>
-                <w:rFonts w:asciiTheme="minorHAnsi" w:hAnsiTheme="minorHAnsi" w:cstheme="minorHAnsi"/>
-              </w:rPr>
-            </w:pPr>
             <w:r>
-              <w:rPr>
-                <w:rFonts w:asciiTheme="minorHAnsi" w:hAnsiTheme="minorHAnsi" w:cstheme="minorHAnsi"/>
-                <w:sz w:val="18"/>
-              </w:rPr>
-              <w:t>Hit rate mensal 40%; janelas de 6 meses 20%; janelas de 12 meses 40%.</w:t>
+              <w:t>Hit rate mensal 20%; janelas de 6 meses 20%; janelas de 12 meses 60%.</w:t>
             </w:r>
           </w:p>
         </w:tc>
@@ -1026,7 +1015,7 @@
         <w:rPr>
           <w:rFonts w:asciiTheme="minorHAnsi" w:hAnsiTheme="minorHAnsi" w:cstheme="minorHAnsi"/>
         </w:rPr>
-        <w:t>Consistência. O que fizemos: combinamos a proporção de meses acima do CDI com a de janelas móveis de seis e doze meses acima do CDI. Por quê: os três horizontes distinguem frequência de pequenas entregas, persistência intermediária e experiência de um investidor que permanece por um ano. O horizonte mensal, sozinho, premiaria ganhos pequenos e frequentes mesmo que perdas raras anulassem o resultado. Janelas longas, sozinhas, esconderiam o caminho até o resultado. Os pesos internos 40/20/40 são uma escolha de desenho, não uma estimativa ótima.</w:t>
+        <w:t>Consistência. O que fizemos: combinamos a proporção de meses acima do CDI com a de janelas móveis de seis e doze meses, todas contidas nos mesmos 36 meses comuns acima do CDI. Por quê: os três horizontes distinguem frequência de pequenas entregas, persistência intermediária e persistência em períodos de um ano. O horizonte mensal, sozinho, premiaria ganhos pequenos e frequentes mesmo que perdas raras anulassem o resultado. Janelas longas, sozinhas, esconderiam o caminho até o resultado. Os pesos internos 20/20/60 são uma escolha de desenho, não uma estimativa ótima.</w:t>
       </w:r>
     </w:p>
     <w:p>
@@ -2008,7 +1997,7 @@
         <w:rPr>
           <w:rFonts w:asciiTheme="minorHAnsi" w:hAnsiTheme="minorHAnsi" w:cstheme="minorHAnsi"/>
         </w:rPr>
-        <w:t xml:space="preserve"> Entre os 47 elegíveis, a distribuição foi 9 aprovados com margem, 13 na fronteira, 23 não aprovados e 2 com </w:t>
+        <w:t xml:space="preserve"> Entre os 47 elegíveis, a distribuição foi 9 aprovados com margem, 12 na fronteira, 24 não aprovados e 2 com </w:t>
       </w:r>
       <w:proofErr w:type="spellStart"/>
       <w:r>
@@ -2022,7 +2011,7 @@
         <w:rPr>
           <w:rFonts w:asciiTheme="minorHAnsi" w:hAnsiTheme="minorHAnsi" w:cstheme="minorHAnsi"/>
         </w:rPr>
-        <w:t xml:space="preserve"> flag absoluto. A lista de 22 nomes para diligência é uma fila de trabalho.</w:t>
+        <w:t xml:space="preserve"> flag absoluto. A lista de 21 nomes para diligência é uma fila de trabalho.</w:t>
       </w:r>
     </w:p>
     <w:p>
@@ -2036,63 +2025,55 @@
         <w:rPr>
           <w:rFonts w:asciiTheme="minorHAnsi" w:hAnsiTheme="minorHAnsi" w:cstheme="minorHAnsi"/>
         </w:rPr>
-        <w:t xml:space="preserve">Aprovados com margem: </w:t>
+        <w:t>Aprovados com margem: Tivio Institucional 15; Daycoval Classic 30; BNP Paribas Rubi; SulAmérica Crédito ESG; SulAmérica Crédito Ativo; Compass Yield 30; BTG Pactual Crédito Corporativo I; Bocom BBM Corporate Credit II; e Porto Seguro Ipê.</w:t>
       </w:r>
       <w:proofErr w:type="spellStart"/>
       <w:r>
         <w:rPr>
           <w:rFonts w:asciiTheme="minorHAnsi" w:hAnsiTheme="minorHAnsi" w:cstheme="minorHAnsi"/>
         </w:rPr>
-        <w:t>Tivio</w:t>
       </w:r>
       <w:proofErr w:type="spellEnd"/>
       <w:r>
         <w:rPr>
           <w:rFonts w:asciiTheme="minorHAnsi" w:hAnsiTheme="minorHAnsi" w:cstheme="minorHAnsi"/>
         </w:rPr>
-        <w:t xml:space="preserve"> Institucional 15; Daycoval Classic 30; BNP Paribas Rubi; SulAmérica Crédito ESG; Compass </w:t>
       </w:r>
       <w:proofErr w:type="spellStart"/>
       <w:r>
         <w:rPr>
           <w:rFonts w:asciiTheme="minorHAnsi" w:hAnsiTheme="minorHAnsi" w:cstheme="minorHAnsi"/>
         </w:rPr>
-        <w:t>Yield</w:t>
       </w:r>
       <w:proofErr w:type="spellEnd"/>
       <w:r>
         <w:rPr>
           <w:rFonts w:asciiTheme="minorHAnsi" w:hAnsiTheme="minorHAnsi" w:cstheme="minorHAnsi"/>
         </w:rPr>
-        <w:t xml:space="preserve"> 30; SulAmérica Crédito Ativo; BTG Pactual Crédito Corporativo I; </w:t>
       </w:r>
       <w:proofErr w:type="spellStart"/>
       <w:r>
         <w:rPr>
           <w:rFonts w:asciiTheme="minorHAnsi" w:hAnsiTheme="minorHAnsi" w:cstheme="minorHAnsi"/>
         </w:rPr>
-        <w:t>Bocom</w:t>
       </w:r>
       <w:proofErr w:type="spellEnd"/>
       <w:r>
         <w:rPr>
           <w:rFonts w:asciiTheme="minorHAnsi" w:hAnsiTheme="minorHAnsi" w:cstheme="minorHAnsi"/>
         </w:rPr>
-        <w:t xml:space="preserve"> BBM Corporate </w:t>
       </w:r>
       <w:proofErr w:type="spellStart"/>
       <w:r>
         <w:rPr>
           <w:rFonts w:asciiTheme="minorHAnsi" w:hAnsiTheme="minorHAnsi" w:cstheme="minorHAnsi"/>
         </w:rPr>
-        <w:t>Credit</w:t>
       </w:r>
       <w:proofErr w:type="spellEnd"/>
       <w:r>
         <w:rPr>
           <w:rFonts w:asciiTheme="minorHAnsi" w:hAnsiTheme="minorHAnsi" w:cstheme="minorHAnsi"/>
         </w:rPr>
-        <w:t xml:space="preserve"> II; e Porto Seguro Ipê.</w:t>
       </w:r>
     </w:p>
     <w:p>
@@ -2106,91 +2087,93 @@
         <w:rPr>
           <w:rFonts w:asciiTheme="minorHAnsi" w:hAnsiTheme="minorHAnsi" w:cstheme="minorHAnsi"/>
         </w:rPr>
-        <w:t xml:space="preserve">Na fronteira: JGP Corporate FEEDER II; Sparta Max Advisory; Polo Crédito Corporativo Advisory; </w:t>
+        <w:t>Na fronteira: Sparta Max Advisory; Occam Crédito Corporativo 30; JGP Crédito Advisory; JGP Corporate FEEDER II; Polo Crédito Corporativo Advisory; Root Capital Crédito HG Plus; Sparta Top; Novus Crédito; BOCOM BBM Corporate Credit Plus MULT; Selection Light; Safra Grand Vitesse; e BNP Paribas Match Plus 30 Advisory. Para cada caso, a ficha deve registrar se a causa é proximidade do corte, pilar abaixo de 30 ou ambos.</w:t>
       </w:r>
       <w:proofErr w:type="spellStart"/>
       <w:r>
         <w:rPr>
           <w:rFonts w:asciiTheme="minorHAnsi" w:hAnsiTheme="minorHAnsi" w:cstheme="minorHAnsi"/>
         </w:rPr>
-        <w:t>Occam</w:t>
       </w:r>
       <w:proofErr w:type="spellEnd"/>
       <w:r>
         <w:rPr>
           <w:rFonts w:asciiTheme="minorHAnsi" w:hAnsiTheme="minorHAnsi" w:cstheme="minorHAnsi"/>
         </w:rPr>
-        <w:t xml:space="preserve"> Crédito Corporativo 30; Sparta Top; JGP Crédito Advisory; Root Capital Crédito HG Plus; </w:t>
       </w:r>
       <w:proofErr w:type="spellStart"/>
       <w:r>
         <w:rPr>
           <w:rFonts w:asciiTheme="minorHAnsi" w:hAnsiTheme="minorHAnsi" w:cstheme="minorHAnsi"/>
         </w:rPr>
-        <w:t>Novus</w:t>
       </w:r>
       <w:proofErr w:type="spellEnd"/>
       <w:r>
         <w:rPr>
           <w:rFonts w:asciiTheme="minorHAnsi" w:hAnsiTheme="minorHAnsi" w:cstheme="minorHAnsi"/>
         </w:rPr>
-        <w:t xml:space="preserve"> Crédito; </w:t>
       </w:r>
       <w:proofErr w:type="spellStart"/>
       <w:r>
         <w:rPr>
           <w:rFonts w:asciiTheme="minorHAnsi" w:hAnsiTheme="minorHAnsi" w:cstheme="minorHAnsi"/>
         </w:rPr>
-        <w:t>Selection</w:t>
       </w:r>
       <w:proofErr w:type="spellEnd"/>
       <w:r>
         <w:rPr>
           <w:rFonts w:asciiTheme="minorHAnsi" w:hAnsiTheme="minorHAnsi" w:cstheme="minorHAnsi"/>
         </w:rPr>
-        <w:t xml:space="preserve"> Light; BNP Paribas Match Plus 30 Advisory; BOCOM BBM Corporate </w:t>
       </w:r>
       <w:proofErr w:type="spellStart"/>
       <w:r>
         <w:rPr>
           <w:rFonts w:asciiTheme="minorHAnsi" w:hAnsiTheme="minorHAnsi" w:cstheme="minorHAnsi"/>
         </w:rPr>
-        <w:t>Credit</w:t>
       </w:r>
       <w:proofErr w:type="spellEnd"/>
       <w:r>
         <w:rPr>
           <w:rFonts w:asciiTheme="minorHAnsi" w:hAnsiTheme="minorHAnsi" w:cstheme="minorHAnsi"/>
         </w:rPr>
-        <w:t xml:space="preserve"> Plus MULT; Safra Grand </w:t>
       </w:r>
       <w:proofErr w:type="spellStart"/>
       <w:r>
         <w:rPr>
           <w:rFonts w:asciiTheme="minorHAnsi" w:hAnsiTheme="minorHAnsi" w:cstheme="minorHAnsi"/>
         </w:rPr>
-        <w:t>Vitesse</w:t>
       </w:r>
       <w:proofErr w:type="spellEnd"/>
       <w:r>
         <w:rPr>
           <w:rFonts w:asciiTheme="minorHAnsi" w:hAnsiTheme="minorHAnsi" w:cstheme="minorHAnsi"/>
         </w:rPr>
-        <w:t xml:space="preserve">; e </w:t>
       </w:r>
       <w:proofErr w:type="spellStart"/>
       <w:r>
         <w:rPr>
           <w:rFonts w:asciiTheme="minorHAnsi" w:hAnsiTheme="minorHAnsi" w:cstheme="minorHAnsi"/>
         </w:rPr>
-        <w:t>Vinland</w:t>
       </w:r>
       <w:proofErr w:type="spellEnd"/>
       <w:r>
         <w:rPr>
           <w:rFonts w:asciiTheme="minorHAnsi" w:hAnsiTheme="minorHAnsi" w:cstheme="minorHAnsi"/>
         </w:rPr>
-        <w:t xml:space="preserve"> Crédito. Para cada caso, a ficha deve registrar se a causa é proximidade do corte, pilar abaixo de 30 ou ambos.</w:t>
+      </w:r>
+    </w:p>
+    <w:p>
+      <w:pPr>
+        <w:pStyle w:val="Heading2"/>
+      </w:pPr>
+      <w:r>
+        <w:t>Teste de robustez da janela de consistência</w:t>
+      </w:r>
+    </w:p>
+    <w:p>
+      <w:pPr/>
+      <w:r>
+        <w:t>A sensibilidade recalculou apenas a consistência com 48, 60 e 72 meses de histórico, mantendo a escala de notas calibrada nos 47 fundos da análise oficial. Cada teste considerou somente fundos com a respectiva série completa e comparou posições dentro desse mesmo subconjunto: 39, 36 e 34 fundos, respectivamente. Em 48 e 60 meses, nenhuma aprovação quantitativa mudou; houve uma alteração de fronteira em cada teste. Em 72 meses, três fundos da zona cinzenta passariam a aprovados com margem e cinco mudariam de condição de fronteira. O maior deslocamento de posição foi de cinco lugares em cada horizonte. Exigir 72 meses excluiria 13 dos 47 fundos e confundiria a extensão temporal com a mudança do universo. Por isso mantivemos os 36 meses comuns como metodologia oficial. O teste documenta a sensibilidade, sem alterar a fila de diligência ou promover fundos automaticamente; não foi definida investigação adicional dos três casos apenas por esse resultado.</w:t>
       </w:r>
     </w:p>
     <w:p>
@@ -2408,7 +2391,7 @@
         <w:rPr>
           <w:rFonts w:asciiTheme="minorHAnsi" w:hAnsiTheme="minorHAnsi" w:cstheme="minorHAnsi"/>
         </w:rPr>
-        <w:t>Próximos passos: validar os avisos de dados e confirmar se os nove nomes cadastrados correspondem à carteira vigente; abrir fichas para os 22 priorizados; obter carteiras, contratos e dados de liquidez; verificar as possíveis redundâncias sinalizadas; realizar a análise econômica prospectiva com premissas verificadas; e devolver ao comitê propostas individuais documentadas. A simulação de impacto de cada candidato no portfólio agregado ainda não faz parte desta entrega. Produtos fora da janela comum podem seguir trilha excepcional, com evidência alternativa e limitação explícitas.</w:t>
+        <w:t>Próximos passos: validar os avisos de dados e confirmar se os nove nomes cadastrados correspondem à carteira vigente; abrir fichas para os 21 priorizados; obter carteiras, contratos e dados de liquidez; verificar as possíveis redundâncias sinalizadas; realizar a análise econômica prospectiva com premissas verificadas; e devolver ao comitê propostas individuais documentadas. A simulação de impacto de cada candidato no portfólio agregado ainda não faz parte desta entrega. Produtos fora da janela comum podem seguir trilha excepcional, com evidência alternativa e limitação explícitas.</w:t>
       </w:r>
     </w:p>
     <w:p>
@@ -5894,7 +5877,7 @@
               <w:rFonts w:ascii="Cambria Math" w:hAnsi="Cambria Math" w:cstheme="minorHAnsi"/>
               <w:lang w:val="en-US"/>
             </w:rPr>
-            <m:t xml:space="preserve"> = 0,40</m:t>
+            <m:t xml:space="preserve"> = 0,20</m:t>
           </m:r>
           <m:sSub>
             <m:sSubPr>
@@ -5982,7 +5965,7 @@
               <w:rFonts w:ascii="Cambria Math" w:hAnsi="Cambria Math" w:cstheme="minorHAnsi"/>
               <w:lang w:val="en-US"/>
             </w:rPr>
-            <m:t xml:space="preserve"> + 0,40</m:t>
+            <m:t xml:space="preserve"> + 0,60</m:t>
           </m:r>
           <m:sSub>
             <m:sSubPr>
@@ -7397,7 +7380,7 @@
         <w:rPr>
           <w:rFonts w:asciiTheme="minorHAnsi" w:hAnsiTheme="minorHAnsi" w:cstheme="minorHAnsi"/>
         </w:rPr>
-        <w:t>O resultado de setembro de 2026 deve ser lido junto à data de corte, janela, composição do universo, métricas brutas, notas de pilar, flags e versão dos parâmetros. A análise de sensibilidade deve mostrar se conclusões materiais persistem sob variações razoáveis de pesos e fronteiras. Mudança de classificação entre rodadas deve ser decomposta em dados, universo, parâmetros e comportamento efetivo do fundo.</w:t>
+        <w:t>O resultado da rodada encerrada em agosto de 2026 deve ser lido junto à data de corte, janela, composição do universo, métricas brutas, notas de pilar, flags e versão dos parâmetros. A análise de sensibilidade deve mostrar se conclusões materiais persistem sob variações razoáveis de pesos e fronteiras. Mudança de classificação entre rodadas deve ser decomposta em dados, universo, parâmetros e comportamento efetivo do fundo.</w:t>
       </w:r>
     </w:p>
     <w:sectPr>

</xml_diff>